<commit_message>
Sales, commercials and support documents for AML/CFT, IC registers, BIR and EOPT, integrations, dealer programmes, branding, My Work and the Report Builder; new optional price lines to confirm by management; builds of the brochures, deck and workbooks
</commit_message>
<xml_diff>
--- a/docs/package/01_Sales/iNXT_BrokerVerse_Brochure.docx
+++ b/docs/package/01_Sales/iNXT_BrokerVerse_Brochure.docx
@@ -219,7 +219,7 @@
                 <w:color w:val="FFFFFF"/>
                 <w:sz w:val="30"/>
               </w:rPr>
-              <w:t>Placement, policy servicing, broker accounting and BIR working papers in one system, built for Philippine non-life insurance brokers.</w:t>
+              <w:t>Placement, policy servicing, broker accounting, BIR returns and AML/CFT compliance in one system, built for Philippine non-life insurance brokers.</w:t>
             </w:r>
           </w:p>
           <w:tbl>
@@ -432,7 +432,7 @@
                 <w:color w:val="0B2A4A"/>
                 <w:sz w:val="40"/>
               </w:rPr>
-              <w:t>854</w:t>
+              <w:t>1,291</w:t>
             </w:r>
           </w:p>
           <w:p>
@@ -485,7 +485,7 @@
                 <w:color w:val="0B2A4A"/>
                 <w:sz w:val="40"/>
               </w:rPr>
-              <w:t>39</w:t>
+              <w:t>8</w:t>
             </w:r>
           </w:p>
           <w:p>
@@ -501,7 +501,7 @@
                 <w:color w:val="51606F"/>
                 <w:sz w:val="17"/>
               </w:rPr>
-              <w:t>reports</w:t>
+              <w:t>connectors</w:t>
             </w:r>
           </w:p>
         </w:tc>
@@ -538,7 +538,7 @@
                 <w:color w:val="0B2A4A"/>
                 <w:sz w:val="40"/>
               </w:rPr>
-              <w:t>16</w:t>
+              <w:t>32</w:t>
             </w:r>
           </w:p>
           <w:p>
@@ -591,7 +591,7 @@
                 <w:color w:val="0B2A4A"/>
                 <w:sz w:val="40"/>
               </w:rPr>
-              <w:t>7</w:t>
+              <w:t>8</w:t>
             </w:r>
           </w:p>
           <w:p>
@@ -679,7 +679,7 @@
           <w:color w:val="51606F"/>
           <w:sz w:val="15"/>
         </w:rPr>
-        <w:t>Figures of the OOTB release test of 03 and 04 October 2026: 480 of the 497 test cases passed, a 23-step policy life cycle passed end to end, and every role was checked on all 173 menu screens.</w:t>
+        <w:t>APIs, connectors, jobs and personas of the current build. Release test of 03 and 04 October 2026: 480 of the 497 test cases passed, a 23-step policy life cycle passed end to end, every role checked on its menu screens.</w:t>
       </w:r>
     </w:p>
     <w:p>
@@ -2081,7 +2081,7 @@
                 <w:color w:val="1E2B38"/>
                 <w:sz w:val="17"/>
               </w:rPr>
-              <w:t>Prospects with bulk upload, Quick Quote and Compare Insurers for packaged products, and a five-step motor quotation with CTPL and Auto Passenger PA. The server re-prices every quotation from the configured rates. The client approves online through a signed link.</w:t>
+              <w:t>Prospects with assignment rules, dealer programmes for brand-new vehicles, Quick Quote and Compare Insurers, and a five-step motor quotation with CTPL. The server re-prices every quotation and applies the acceptance rules. The client approves online through a signed link.</w:t>
             </w:r>
           </w:p>
         </w:tc>
@@ -2377,7 +2377,7 @@
                 <w:color w:val="1E2B38"/>
                 <w:sz w:val="17"/>
               </w:rPr>
-              <w:t>Claim registration with the Preliminary Loss Advice to the insurer, adjuster follow-up, settlement by maker and approval by a second Claims user, co-insurer shares, claims paid through the broker, claim letters on the letterhead.</w:t>
+              <w:t>Claim registration with the Preliminary Loss Advice to the insurer, document checklist with reminders, motor repairs and letters of authority, settlement by maker and approval by a second Claims user, co-insurer shares, claims paid through the broker.</w:t>
             </w:r>
           </w:p>
         </w:tc>
@@ -2525,7 +2525,7 @@
                 <w:color w:val="1E2B38"/>
                 <w:sz w:val="17"/>
               </w:rPr>
-              <w:t>Premium invoices on issue, endorsement and renewal. Official receipts from the OR series, posted only by Accounting after verifying the payment. Receipt and invoice PDFs e-mailed to the client. Payment links through PayMongo or Dragonpay.</w:t>
+              <w:t>Premium and instalment invoices, official receipts posted only by Accounting after verifying the payment, EOPT sales invoices for commission and fees, post-dated cheques. PDFs e-mailed to the client. Payment links through PayMongo or Dragonpay.</w:t>
             </w:r>
           </w:p>
         </w:tc>
@@ -2887,7 +2887,7 @@
                 <w:color w:val="1E2B38"/>
                 <w:sz w:val="17"/>
               </w:rPr>
-              <w:t>Commission Rate Matrix by insurer, product, line and policy type. Accrued at issue, payable to referrers when the premium is fully collected, paid by voucher less withholding tax, clawed back on return premium.</w:t>
+              <w:t>Commission Rate Matrix by insurer, product, line and policy type. Paid to licensed referrers when the premium is fully collected, by voucher or bank file less withholding tax. Overriding commission and incentive programmes.</w:t>
             </w:r>
           </w:p>
         </w:tc>
@@ -3120,7 +3120,7 @@
                 <w:color w:val="1E2B38"/>
                 <w:sz w:val="17"/>
               </w:rPr>
-              <w:t>BIR Form 2307 issued by the broker and received from insurers and clients, VAT Summary, SAWT, QAP, SLSP Sales and SLSP Purchases. Tax codes carry rate, BIR ATC and GL account.</w:t>
+              <w:t>BIR Form 2307, 0619-E, 1601-EQ, 1604-E and 2551Q reconciled to the ledger, VAT Summary, SAWT, QAP, SLSP and their DAT files, EOPT sales invoices, the EIS connector and the CAS books pack.</w:t>
             </w:r>
           </w:p>
         </w:tc>
@@ -3253,7 +3253,7 @@
                 <w:color w:val="0B2A4A"/>
                 <w:sz w:val="21"/>
               </w:rPr>
-              <w:t>Incentives</w:t>
+              <w:t>AML/CFT and IC compliance</w:t>
             </w:r>
           </w:p>
           <w:p>
@@ -3268,7 +3268,7 @@
                 <w:color w:val="1E2B38"/>
                 <w:sz w:val="17"/>
               </w:rPr>
-              <w:t>Incentive programmes for account executives on premium, policy count, renewal rate or conversion. Calculations approved by a second Accounting user, statements per person, accrual and payment through posting rules.</w:t>
+              <w:t>Client onboarding, risk rating and EDD, list screening, covered and suspicious transaction alerts, cases and AMLC report files. Licence register, insurer authority check, complaints register and IC working papers.</w:t>
             </w:r>
           </w:p>
         </w:tc>
@@ -3331,7 +3331,7 @@
                 <w:color w:val="1E2B38"/>
                 <w:sz w:val="17"/>
               </w:rPr>
-              <w:t>39 catalogue reports on screen, in Excel, CSV or PDF on the company letterhead, with scheduled delivery by e-mail. Executive, Sales, Processing, Claims and Commission dashboards with live figures.</w:t>
+              <w:t>Catalogue reports in Excel, CSV or PDF on your letterhead, a Report Builder for ad hoc questions, a BI extract, live dashboards, and My Work: each person’s items, team, tasks and calendar.</w:t>
             </w:r>
           </w:p>
         </w:tc>
@@ -3416,7 +3416,7 @@
                 <w:color w:val="1E2B38"/>
                 <w:sz w:val="17"/>
               </w:rPr>
-              <w:t>Seven roles checked by the server on every request, two-step verification, lockout and password policy, Authority Matrix, Delegations, Segregation of Duties, Access Reviews and an Audit Trail with before and after values.</w:t>
+              <w:t>Eight roles checked by the server on every request, two-step verification, Authority Matrix, Segregation of Duties, Access Reviews, masking of personal identifiers by role and an Audit Trail with before and after values.</w:t>
             </w:r>
           </w:p>
         </w:tc>
@@ -3479,7 +3479,7 @@
                 <w:color w:val="1E2B38"/>
                 <w:sz w:val="17"/>
               </w:rPr>
-              <w:t>Consent Register per purpose, Data Subject Requests register with due dates, personal data export for access and portability, and anonymisation once the retention period of the records has passed.</w:t>
+              <w:t>Consent per purpose, Data Subject Requests with due dates, export and anonymisation, encryption of TIN, ID and bank numbers, a breach register on the NPC 72-hour clock, and masking of test copies.</w:t>
             </w:r>
           </w:p>
         </w:tc>
@@ -3789,7 +3789,7 @@
                       <w:color w:val="FFFFFF"/>
                       <w:sz w:val="20"/>
                     </w:rPr>
-                    <w:t>Approval notifications</w:t>
+                    <w:t>Integrations</w:t>
                   </w:r>
                 </w:p>
                 <w:p>
@@ -3804,7 +3804,7 @@
                       <w:color w:val="D3E6FA"/>
                       <w:sz w:val="16"/>
                     </w:rPr>
-                    <w:t>Every maker-checker flow tells the people who can approve it, and the maker hears of the approval or rejection with the reason.</w:t>
+                    <w:t>SMS and Viber, CTPL authentication, insurer APIs and bank payment files through one monitored outbox. Delivered in test mode; each partner certifies its side.</w:t>
                   </w:r>
                 </w:p>
               </w:tc>
@@ -3830,7 +3830,7 @@
                       <w:color w:val="FFFFFF"/>
                       <w:sz w:val="20"/>
                     </w:rPr>
-                    <w:t>Documents by e-mail</w:t>
+                    <w:t>Your brand everywhere</w:t>
                   </w:r>
                 </w:p>
                 <w:p>
@@ -3845,7 +3845,7 @@
                       <w:color w:val="D3E6FA"/>
                       <w:sz w:val="16"/>
                     </w:rPr>
-                    <w:t>Official receipts and premium invoices e-mailed to the client with the PDF attached; debit notes and policy schedules attached too.</w:t>
+                    <w:t>Theme, logo and sign-in page; branded documents, reports and e-mails; e-signatures mapped to the documents they sign.</w:t>
                   </w:r>
                 </w:p>
               </w:tc>
@@ -3871,7 +3871,7 @@
                       <w:color w:val="FFFFFF"/>
                       <w:sz w:val="20"/>
                     </w:rPr>
-                    <w:t>Data privacy registers</w:t>
+                    <w:t>Compliance built in</w:t>
                   </w:r>
                 </w:p>
                 <w:p>
@@ -3886,7 +3886,7 @@
                       <w:color w:val="D3E6FA"/>
                       <w:sz w:val="16"/>
                     </w:rPr>
-                    <w:t>Consent Register and Data Subject Requests under Master &gt; Data Privacy, with personal data export and anonymisation.</w:t>
+                    <w:t>AML/CFT toolkit, IC registers and BIR returns with DAT files. Your compliance officer and tax adviser confirm the settings.</w:t>
                   </w:r>
                 </w:p>
               </w:tc>
@@ -3917,7 +3917,7 @@
           <w:sz w:val="17"/>
           <w:spacing w:val="30"/>
         </w:rPr>
-        <w:t>SEVEN PERSONAS</w:t>
+        <w:t>EIGHT PERSONAS</w:t>
       </w:r>
     </w:p>
     <w:p>
@@ -4260,7 +4260,7 @@
                 <w:color w:val="1E2B38"/>
                 <w:sz w:val="17"/>
               </w:rPr>
-              <w:t>Clients and their policies in one view, endorsement requests, payment capture for verification, Open Items worklist of expiring policies and pending payments.</w:t>
+              <w:t>Clients and their policies in one view, client onboarding, endorsement requests, cover notes, payment capture for verification, and My Work for everything due.</w:t>
             </w:r>
           </w:p>
         </w:tc>
@@ -4580,7 +4580,87 @@
                 <w:color w:val="1E2B38"/>
                 <w:sz w:val="17"/>
               </w:rPr>
-              <w:t>Users and roles, company and letterhead, insurers and credit terms, number series, posting rules, configuration, schedules and the audit trail.</w:t>
+              <w:t>Users and roles, theme and branding, integrations, number series, posting rules, configuration, go-live data load, schedules and the audit trail.</w:t>
+            </w:r>
+          </w:p>
+        </w:tc>
+      </w:tr>
+      <w:tr>
+        <w:trPr>
+          <w:cantSplit/>
+        </w:trPr>
+        <w:tc>
+          <w:tcPr>
+            <w:tcW w:type="dxa" w:w="2608"/>
+            <w:shd w:val="clear" w:color="auto" w:fill="0F4761"/>
+            <w:tcMar>
+              <w:top w:w="90" w:type="dxa"/>
+              <w:start w:w="170" w:type="dxa"/>
+              <w:left w:w="170" w:type="dxa"/>
+              <w:bottom w:w="90" w:type="dxa"/>
+              <w:end w:w="113" w:type="dxa"/>
+              <w:right w:w="113" w:type="dxa"/>
+            </w:tcMar>
+            <w:vAlign w:val="center"/>
+          </w:tcPr>
+          <w:p>
+            <w:pPr>
+              <w:spacing w:before="0" w:after="0" w:line="240" w:lineRule="auto"/>
+            </w:pPr>
+            <w:r>
+              <w:rPr>
+                <w:rFonts w:ascii="Segoe UI" w:hAnsi="Segoe UI" w:cs="Segoe UI" w:eastAsia="Segoe UI"/>
+                <w:b/>
+                <w:i w:val="0"/>
+                <w:color w:val="FFFFFF"/>
+                <w:sz w:val="20"/>
+              </w:rPr>
+              <w:t>Compliance Officer</w:t>
+            </w:r>
+          </w:p>
+          <w:p>
+            <w:pPr>
+              <w:spacing w:before="0" w:after="0" w:line="240" w:lineRule="auto"/>
+            </w:pPr>
+            <w:r>
+              <w:rPr>
+                <w:rFonts w:ascii="Segoe UI" w:hAnsi="Segoe UI" w:cs="Segoe UI" w:eastAsia="Segoe UI"/>
+                <w:b w:val="0"/>
+                <w:i w:val="0"/>
+                <w:color w:val="9CC9F5"/>
+                <w:sz w:val="15"/>
+              </w:rPr>
+              <w:t>AML/CFT</w:t>
+            </w:r>
+          </w:p>
+        </w:tc>
+        <w:tc>
+          <w:tcPr>
+            <w:tcW w:type="dxa" w:w="7711"/>
+            <w:shd w:val="clear" w:color="auto" w:fill="FFFFFF"/>
+            <w:tcMar>
+              <w:top w:w="90" w:type="dxa"/>
+              <w:start w:w="198" w:type="dxa"/>
+              <w:left w:w="198" w:type="dxa"/>
+              <w:bottom w:w="90" w:type="dxa"/>
+              <w:end w:w="170" w:type="dxa"/>
+              <w:right w:w="170" w:type="dxa"/>
+            </w:tcMar>
+            <w:vAlign w:val="center"/>
+          </w:tcPr>
+          <w:p>
+            <w:pPr>
+              <w:spacing w:before="0" w:after="0" w:line="276" w:lineRule="auto"/>
+            </w:pPr>
+            <w:r>
+              <w:rPr>
+                <w:rFonts w:ascii="Segoe UI" w:hAnsi="Segoe UI" w:cs="Segoe UI" w:eastAsia="Segoe UI"/>
+                <w:b w:val="0"/>
+                <w:i w:val="0"/>
+                <w:color w:val="1E2B38"/>
+                <w:sz w:val="17"/>
+              </w:rPr>
+              <w:t>Client due diligence and EDD approval, screening hits and lists, transaction alerts, AML cases and the AMLC report files.</w:t>
             </w:r>
           </w:p>
         </w:tc>
@@ -4795,7 +4875,7 @@
                 <w:color w:val="1E2B38"/>
                 <w:sz w:val="16"/>
               </w:rPr>
-              <w:t>Certificate number and authentication code on the policy</w:t>
+              <w:t>CTPL authentication and COC series through the provider connector</w:t>
             </w:r>
           </w:p>
         </w:tc>
@@ -5001,7 +5081,7 @@
                 <w:color w:val="1E2B38"/>
                 <w:sz w:val="16"/>
               </w:rPr>
-              <w:t>BIR Form 2307 issued and received, CWT series</w:t>
+              <w:t>BIR Form 2307, 0619-E, 1601-EQ, 1604-E and 2551Q</w:t>
             </w:r>
           </w:p>
           <w:p>
@@ -5027,7 +5107,7 @@
                 <w:color w:val="1E2B38"/>
                 <w:sz w:val="16"/>
               </w:rPr>
-              <w:t>VAT Summary for the VAT return</w:t>
+              <w:t>SAWT, QAP, SLSP and their BIR DAT files</w:t>
             </w:r>
           </w:p>
           <w:p>
@@ -5053,7 +5133,7 @@
                 <w:color w:val="1E2B38"/>
                 <w:sz w:val="16"/>
               </w:rPr>
-              <w:t>SAWT, QAP, SLSP Sales and Purchases in BIR column order</w:t>
+              <w:t>EOPT sales invoices and the EIS connector</w:t>
             </w:r>
           </w:p>
           <w:p>
@@ -5079,7 +5159,7 @@
                 <w:color w:val="1E2B38"/>
                 <w:sz w:val="16"/>
               </w:rPr>
-              <w:t>EWT codes with ATC, for example WI139, WC139, WI515</w:t>
+              <w:t>CAS books pack: loose-leaf books, system description</w:t>
             </w:r>
           </w:p>
         </w:tc>
@@ -5151,7 +5231,7 @@
                 <w:color w:val="0B2A4A"/>
                 <w:sz w:val="20"/>
               </w:rPr>
-              <w:t>Insurance Commission records</w:t>
+              <w:t>IC and AMLA</w:t>
             </w:r>
           </w:p>
           <w:p>
@@ -5177,7 +5257,7 @@
                 <w:color w:val="1E2B38"/>
                 <w:sz w:val="16"/>
               </w:rPr>
-              <w:t>Registers of slips, placements, policies, claims and renewals</w:t>
+              <w:t>Licence register; commission held for unlicensed agents</w:t>
             </w:r>
           </w:p>
           <w:p>
@@ -5203,7 +5283,7 @@
                 <w:color w:val="1E2B38"/>
                 <w:sz w:val="16"/>
               </w:rPr>
-              <w:t>Premium due to insurers kept apart from commission income</w:t>
+              <w:t>Insurer certificate of authority checked at placement</w:t>
             </w:r>
           </w:p>
           <w:p>
@@ -5229,7 +5309,7 @@
                 <w:color w:val="1E2B38"/>
                 <w:sz w:val="16"/>
               </w:rPr>
-              <w:t>Remittance terms per insurer and Remittance Ageing</w:t>
+              <w:t>Complaints register (RA 11765), IC working papers</w:t>
             </w:r>
           </w:p>
           <w:p>
@@ -5255,7 +5335,7 @@
                 <w:color w:val="1E2B38"/>
                 <w:sz w:val="16"/>
               </w:rPr>
-              <w:t>Reports in Excel, CSV and PDF for examination</w:t>
+              <w:t>AML/CFT: risk rating, screening, CTR and STR files</w:t>
             </w:r>
           </w:p>
         </w:tc>
@@ -5345,7 +5425,7 @@
                 <w:color w:val="1E2B38"/>
                 <w:sz w:val="16"/>
               </w:rPr>
-              <w:t>Data subject requests numbered DSR- with due dates</w:t>
+              <w:t>Data subject requests with due dates, export, anonymisation</w:t>
             </w:r>
           </w:p>
           <w:p>
@@ -5371,7 +5451,7 @@
                 <w:color w:val="1E2B38"/>
                 <w:sz w:val="16"/>
               </w:rPr>
-              <w:t>Personal data export and anonymisation with retention rules</w:t>
+              <w:t>Identifiers masked by role and encrypted at rest</w:t>
             </w:r>
           </w:p>
           <w:p>
@@ -5397,7 +5477,7 @@
                 <w:color w:val="1E2B38"/>
                 <w:sz w:val="16"/>
               </w:rPr>
-              <w:t>Role-based access, audit trail, signed document links</w:t>
+              <w:t>Breach register on the NPC 72-hour clock</w:t>
             </w:r>
           </w:p>
         </w:tc>
@@ -5461,7 +5541,7 @@
                 <w:color w:val="1E2B38"/>
                 <w:sz w:val="16"/>
               </w:rPr>
-              <w:t>PHP amounts and Asia/Manila business time</w:t>
+              <w:t>Regions, provinces, cities and barangays (PSGC)</w:t>
             </w:r>
           </w:p>
           <w:p>
@@ -5487,7 +5567,7 @@
                 <w:color w:val="1E2B38"/>
                 <w:sz w:val="16"/>
               </w:rPr>
-              <w:t>TIN, 4-digit ZIP code, Philippine mobile numbers</w:t>
+              <w:t>TIN, ZIP codes, Philippine mobile numbers, holidays</w:t>
             </w:r>
           </w:p>
           <w:p>
@@ -5539,7 +5619,7 @@
                 <w:color w:val="1E2B38"/>
                 <w:sz w:val="16"/>
               </w:rPr>
-              <w:t>Bank statement layouts for BDO, BPI and Metrobank</w:t>
+              <w:t>Bank statement and payment file layouts</w:t>
             </w:r>
           </w:p>
         </w:tc>
@@ -7062,7 +7142,7 @@
                 <w:color w:val="1E2B38"/>
                 <w:sz w:val="16"/>
               </w:rPr>
-              <w:t>Up to 3 offices, 26 to 75 users, up to 25 insurers, up to 25,000 in-force policies.</w:t>
+              <w:t>Up to 3 offices, 26 to 100 users, up to 25 insurers, up to 25,000 in-force policies.</w:t>
             </w:r>
           </w:p>
           <w:p>
@@ -7152,7 +7232,7 @@
                 <w:color w:val="1E2B38"/>
                 <w:sz w:val="16"/>
               </w:rPr>
-              <w:t>More than 3 offices and 75 users, many insurers, more than 25,000 in-force policies.</w:t>
+              <w:t>More than 3 offices and 100 users, many insurers, more than 25,000 in-force policies.</w:t>
             </w:r>
           </w:p>
           <w:p>
@@ -7650,7 +7730,7 @@
                 <w:color w:val="1E2B38"/>
                 <w:sz w:val="17"/>
               </w:rPr>
-              <w:t>The broker uses the delivered screens, workflows, reports and printed documents. Customisation of screens, reports or documents and new integrations (insurer systems, core banking, bank payment files, SMS, BIR eFPS or eBIRForms) are outside the OOTB scope and are handled as change requests, estimated and priced before any work starts.</w:t>
+              <w:t>The broker uses the delivered screens, workflows, reports, documents and connectors. Each connector (SMS, CTPL provider, insurer, bank, BIR EIS) goes live when its partner accepts the interface. Customisation and new kinds of integration (core banking, eFPS) are change requests, estimated and priced before any work starts.</w:t>
             </w:r>
           </w:p>
         </w:tc>
@@ -8966,7 +9046,7 @@
                       <w:color w:val="1E2B38"/>
                       <w:sz w:val="17"/>
                     </w:rPr>
-                    <w:t>CTPL tariff, premium taxes, BIR working papers, IC records and the Data Privacy Act are part of the product, not a project.</w:t>
+                    <w:t>CTPL, premium taxes, BIR returns and EOPT invoices, AML/CFT, IC registers and the Data Privacy Act are part of the product, not a project.</w:t>
                   </w:r>
                 </w:p>
               </w:tc>
@@ -9161,7 +9241,7 @@
                       <w:color w:val="1E2B38"/>
                       <w:sz w:val="17"/>
                     </w:rPr>
-                    <w:t>A 186-page user manual, seven role decks, a reports book, architecture, compliance matrix, data migration, training and support documents.</w:t>
+                    <w:t>A user manual opened on each screen with F1, role decks, requirements, process flows, test plans, reports book and support runbooks.</w:t>
                   </w:r>
                 </w:p>
               </w:tc>
@@ -9454,7 +9534,7 @@
                       <w:color w:val="1E2B38"/>
                       <w:sz w:val="17"/>
                     </w:rPr>
-                    <w:t>React, Node.js and PostgreSQL with permissively licensed components; 854 APIs documented in OpenAPI; runs on AWS, Azure or your own servers.</w:t>
+                    <w:t>React, Node.js and PostgreSQL with permissively licensed components; 1,291 APIs documented in OpenAPI; runs on AWS, Azure or your own servers.</w:t>
                   </w:r>
                 </w:p>
               </w:tc>
@@ -10143,7 +10223,7 @@
                 <w:color w:val="51606F"/>
                 <w:sz w:val="14"/>
               </w:rPr>
-              <w:t>iNXT BrokerVerse, OOTB edition, version 1.0. Product facts and figures are taken from the system and its release test of 03 October 2026. Timelines, service levels and prices are confirmed in the proposal and the agreements. BrokerVerse produces records and working papers; filings with the BIR, the Insurance Commission and the National Privacy Commission remain with the broker.</w:t>
+              <w:t>iNXT BrokerVerse, OOTB edition, brochure of 04 October 2026. Product facts are taken from the system; test figures from the release test of 03 October 2026. Timelines, service levels and prices are confirmed in the proposal and the agreements. BrokerVerse produces records and working papers; filings with the BIR, the Insurance Commission, the AMLC and the National Privacy Commission, partner certifications and tax advice remain with the broker and its partners.</w:t>
             </w:r>
           </w:p>
         </w:tc>

</xml_diff>

<commit_message>
Fit assessment workbook, fit-gap register and sales materials rebuilt with the release verification figures
</commit_message>
<xml_diff>
--- a/docs/package/01_Sales/iNXT_BrokerVerse_Brochure.docx
+++ b/docs/package/01_Sales/iNXT_BrokerVerse_Brochure.docx
@@ -432,7 +432,7 @@
                 <w:color w:val="0B2A4A"/>
                 <w:sz w:val="40"/>
               </w:rPr>
-              <w:t>1,291</w:t>
+              <w:t>1,356</w:t>
             </w:r>
           </w:p>
           <w:p>
@@ -538,7 +538,7 @@
                 <w:color w:val="0B2A4A"/>
                 <w:sz w:val="40"/>
               </w:rPr>
-              <w:t>32</w:t>
+              <w:t>35</w:t>
             </w:r>
           </w:p>
           <w:p>
@@ -644,7 +644,7 @@
                 <w:color w:val="0B2A4A"/>
                 <w:sz w:val="40"/>
               </w:rPr>
-              <w:t>497</w:t>
+              <w:t>629</w:t>
             </w:r>
           </w:p>
           <w:p>
@@ -679,7 +679,7 @@
           <w:color w:val="51606F"/>
           <w:sz w:val="15"/>
         </w:rPr>
-        <w:t>APIs, connectors, jobs and personas of the current build. Release test of 03 and 04 October 2026: 480 of the 497 test cases passed, a 23-step policy life cycle passed end to end, every role checked on its menu screens.</w:t>
+        <w:t>APIs, connectors, jobs and personas of the current build. Release test of 03 and 04 October 2026: 480 of the 629 test cases run, a full UAT cycle of 433 business steps passed end to end, every role checked on its menu screens.</w:t>
       </w:r>
     </w:p>
     <w:p>
@@ -9144,7 +9144,7 @@
                       <w:color w:val="1E2B38"/>
                       <w:sz w:val="17"/>
                     </w:rPr>
-                    <w:t>497 test cases, a 634-test business rule regression on PostgreSQL and a full UAT cycle of 371 business steps from set-up to month-end close.</w:t>
+                    <w:t>629 test cases, a 1,113-test business rule regression on PostgreSQL and a full UAT cycle of 433 business steps from set-up to month-end close, plus a 52-check go-live rehearsal.</w:t>
                   </w:r>
                 </w:p>
               </w:tc>

</xml_diff>